<commit_message>
feat: populate Huang Yueh-ling and Liao Howard details into legal power of attorney suite
</commit_message>
<xml_diff>
--- a/3.住/家事訴訟與行政代辦_法定委任書套件.docx
+++ b/3.住/家事訴訟與行政代辦_法定委任書套件.docx
@@ -4,7 +4,7 @@
   <w:body>
     <w:p>
       <w:pPr>
-        <w:spacing w:before="160" w:after="40"/>
+        <w:spacing w:before="120" w:after="40"/>
         <w:jc w:val="center"/>
       </w:pPr>
       <w:r>
@@ -12,70 +12,29 @@
           <w:rFonts w:ascii="PingFang TC" w:hAnsi="PingFang TC"/>
           <w:b/>
           <w:color w:val="1E3A8A"/>
-          <w:sz w:val="36"/>
+          <w:sz w:val="34"/>
         </w:rPr>
-        <w:t>民事／家事事件委任狀</w:t>
+        <w:t>家事委任狀暨聲請許可非律師為訴訟代理人狀</w:t>
       </w:r>
     </w:p>
     <w:p>
       <w:pPr>
-        <w:spacing w:after="240"/>
+        <w:spacing w:after="200"/>
         <w:jc w:val="center"/>
       </w:pPr>
       <w:r>
         <w:rPr>
           <w:rFonts w:ascii="PingFang TC" w:hAnsi="PingFang TC"/>
           <w:color w:val="64748B"/>
-          <w:sz w:val="20"/>
+          <w:sz w:val="19"/>
         </w:rPr>
-        <w:t>司法院標準格式 ‧ 監護宣告／家事保全處分／民事侵權求償專用</w:t>
-      </w:r>
-    </w:p>
-    <w:p>
-      <w:pPr>
-        <w:spacing w:line="312" w:lineRule="auto" w:after="160"/>
-      </w:pPr>
-      <w:r>
-        <w:rPr>
-          <w:b/>
-          <w:sz w:val="22"/>
-        </w:rPr>
-        <w:t>案　　由：聲請監護宣告事件／民事侵害配偶權損害賠償／夫妻剩餘財產分配事件</w:t>
-        <w:br/>
-      </w:r>
-      <w:r>
-        <w:rPr>
-          <w:sz w:val="21"/>
-        </w:rPr>
-        <w:t>受 任 人：　　　　　　　　　　（國民身分證統一編號：　　　　　　　　　）</w:t>
-        <w:br/>
-      </w:r>
-      <w:r>
-        <w:rPr>
-          <w:sz w:val="21"/>
-        </w:rPr>
-        <w:t>委 任 人：　　　　　　　　　　（國民身分證統一編號：　　　　　　　　　）</w:t>
-        <w:br/>
-      </w:r>
-    </w:p>
-    <w:p>
-      <w:pPr>
-        <w:spacing w:line="324" w:lineRule="auto" w:after="160"/>
-      </w:pPr>
-      <w:r>
-        <w:rPr>
-          <w:color w:val="1E293B"/>
-          <w:sz w:val="20"/>
-        </w:rPr>
-        <w:t>委任人因前開事件，茲依法委任受任人為訴訟代理人（或法定代理人）。受任人就本事件有為一切訴訟行為之權，並得代為領取裁判費、提存金、擔保金、訴訟標的物或賠償金，並享有民事訴訟法第70條第1項但書及家事事件法所列各項特別代理權（包括但不限於：捨棄、認諾、撤回、和解、提起反訴、上訴或抗告、選任複代理人、處分和解標的物等權限）。</w:t>
-        <w:br/>
+        <w:t>臺灣臺中地方法院家事法庭 ‧ 115年度家補字第3880號（意股）</w:t>
       </w:r>
     </w:p>
     <w:tbl>
       <w:tblPr>
         <w:tblW w:type="auto" w:w="0"/>
         <w:jc w:val="center"/>
-        <w:tblLayout w:type="fixed"/>
         <w:tblLook w:firstColumn="1" w:firstRow="1" w:lastColumn="0" w:lastRow="0" w:noHBand="0" w:noVBand="1" w:val="04A0"/>
       </w:tblPr>
       <w:tblGrid>
@@ -95,16 +54,19 @@
             <w:shd w:fill="F8FAFC"/>
           </w:tcPr>
           <w:p>
+            <w:pPr>
+              <w:spacing w:line="288" w:lineRule="auto"/>
+            </w:pPr>
             <w:r>
               <w:rPr>
-                <w:b/>
+                <w:color w:val="1E293B"/>
                 <w:sz w:val="19"/>
               </w:rPr>
-              <w:t>委任人（母親）：</w:t>
+              <w:t>案　　號：115年度家補字第3880號</w:t>
               <w:br/>
-              <w:t>住居所：</w:t>
+              <w:t>股　　別：意股</w:t>
               <w:br/>
-              <w:t>聯絡電話：</w:t>
+              <w:t>案　　由：離婚事件（調解期日）</w:t>
             </w:r>
           </w:p>
         </w:tc>
@@ -120,14 +82,21 @@
             <w:shd w:fill="F1F5F9"/>
           </w:tcPr>
           <w:p>
+            <w:pPr>
+              <w:spacing w:line="288" w:lineRule="auto"/>
+            </w:pPr>
             <w:r>
               <w:rPr>
+                <w:color w:val="1E293B"/>
                 <w:sz w:val="19"/>
               </w:rPr>
-              <w:t>（簽名或蓋章／按指印處）</w:t>
+              <w:t>對　　造（聲請人／原告）：</w:t>
               <w:br/>
+              <w:t>廖光輝</w:t>
               <w:br/>
+              <w:t>國民身分證統一編號：</w:t>
               <w:br/>
+              <w:t>住居所：</w:t>
             </w:r>
           </w:p>
         </w:tc>
@@ -145,16 +114,23 @@
             <w:shd w:fill="F8FAFC"/>
           </w:tcPr>
           <w:p>
+            <w:pPr>
+              <w:spacing w:line="288" w:lineRule="auto"/>
+            </w:pPr>
             <w:r>
               <w:rPr>
-                <w:b/>
+                <w:color w:val="1E293B"/>
                 <w:sz w:val="19"/>
               </w:rPr>
-              <w:t>受任人（子女／代理人）：</w:t>
+              <w:t>委任人（相對人／被告）：</w:t>
               <w:br/>
-              <w:t>住居所：</w:t>
+              <w:t>黃月玲</w:t>
               <w:br/>
-              <w:t>聯絡電話：</w:t>
+              <w:t>國民身分證統一編號：M200125756</w:t>
+              <w:br/>
+              <w:t>住居所：臺中市西屯區何安里14鄰青海路一段75巷7號</w:t>
+              <w:br/>
+              <w:t>電話：04-23131433</w:t>
             </w:r>
           </w:p>
         </w:tc>
@@ -164,6 +140,241 @@
             <w:tcMar>
               <w:top w:w="80" w:type="dxa"/>
               <w:bottom w:w="80" w:type="dxa"/>
+              <w:left w:w="100" w:type="dxa"/>
+              <w:right w:w="100" w:type="dxa"/>
+            </w:tcMar>
+            <w:shd w:fill="F1F5F9"/>
+          </w:tcPr>
+          <w:p>
+            <w:pPr>
+              <w:spacing w:line="288" w:lineRule="auto"/>
+            </w:pPr>
+            <w:r>
+              <w:rPr>
+                <w:color w:val="1E293B"/>
+                <w:sz w:val="19"/>
+              </w:rPr>
+              <w:t>受任人（訴訟代理人）：</w:t>
+              <w:br/>
+              <w:t>廖倫豪</w:t>
+              <w:br/>
+              <w:t>國民身分證統一編號：M120547578</w:t>
+              <w:br/>
+              <w:t>住居所：臺中市西屯區青海路一段75巷7號一樓</w:t>
+              <w:br/>
+              <w:t>電話：0975-323161</w:t>
+              <w:br/>
+              <w:t>與委任人關係：母子（一親等直系血親卑親屬）</w:t>
+            </w:r>
+          </w:p>
+        </w:tc>
+      </w:tr>
+      <w:tr>
+        <w:tc>
+          <w:tcPr>
+            <w:tcW w:type="dxa" w:w="4706"/>
+          </w:tcPr>
+          <w:p/>
+        </w:tc>
+        <w:tc>
+          <w:tcPr>
+            <w:tcW w:type="dxa" w:w="4706"/>
+          </w:tcPr>
+          <w:p/>
+        </w:tc>
+      </w:tr>
+      <w:tr>
+        <w:tc>
+          <w:tcPr>
+            <w:tcW w:type="dxa" w:w="4706"/>
+          </w:tcPr>
+          <w:p/>
+        </w:tc>
+        <w:tc>
+          <w:tcPr>
+            <w:tcW w:type="dxa" w:w="4706"/>
+          </w:tcPr>
+          <w:p/>
+        </w:tc>
+      </w:tr>
+    </w:tbl>
+    <w:p>
+      <w:pPr>
+        <w:spacing w:before="160" w:line="300" w:lineRule="auto"/>
+      </w:pPr>
+      <w:r>
+        <w:rPr>
+          <w:b/>
+          <w:color w:val="1E3A8A"/>
+          <w:sz w:val="21"/>
+        </w:rPr>
+        <w:t>為委任訴訟代理人並聲請許可非律師為訴訟代理人事：</w:t>
+        <w:br/>
+      </w:r>
+    </w:p>
+    <w:p>
+      <w:pPr>
+        <w:spacing w:before="40" w:after="40"/>
+      </w:pPr>
+      <w:r>
+        <w:rPr>
+          <w:b/>
+          <w:color w:val="1E3A8A"/>
+          <w:sz w:val="19"/>
+        </w:rPr>
+        <w:t xml:space="preserve">一、委任事項： </w:t>
+      </w:r>
+      <w:r>
+        <w:rPr>
+          <w:color w:val="1E293B"/>
+          <w:sz w:val="19"/>
+        </w:rPr>
+        <w:t>委任人黃月玲與聲請人廖光輝間 115年度家補字第3880號 離婚事件，茲委任受任人廖倫豪為代理人，代理委任人出席本件調解期日及其後之言詞辯論期日、陳述意見、收受文書及閱覽卷宗。</w:t>
+      </w:r>
+    </w:p>
+    <w:p>
+      <w:pPr>
+        <w:spacing w:before="40" w:after="40"/>
+      </w:pPr>
+      <w:r>
+        <w:rPr>
+          <w:b/>
+          <w:color w:val="B91C1C"/>
+          <w:sz w:val="19"/>
+        </w:rPr>
+        <w:t xml:space="preserve">二、代理權限之嚴格限制（保護委任人立場）： </w:t>
+      </w:r>
+      <w:r>
+        <w:rPr>
+          <w:color w:val="1E293B"/>
+          <w:sz w:val="19"/>
+        </w:rPr>
+        <w:t>受任人僅享有一般程序代理權。民事訴訟法第70條第1項但書所定之捨棄、認諾、撤回、和解、提起反訴、上訴、再審及選任代理人等行為，非經委任人另以書面特別委任，不得為之。受任人於調解程序中【堅決不同意離婚、不得同意任何不利之給付金額或條件，亦不得簽署任何調解或和解筆錄】。</w:t>
+      </w:r>
+    </w:p>
+    <w:p>
+      <w:pPr>
+        <w:spacing w:before="40" w:after="40"/>
+      </w:pPr>
+      <w:r>
+        <w:rPr>
+          <w:b/>
+          <w:color w:val="1E3A8A"/>
+          <w:sz w:val="19"/>
+        </w:rPr>
+        <w:t xml:space="preserve">三、聲請許可之理由： </w:t>
+      </w:r>
+      <w:r>
+        <w:rPr>
+          <w:color w:val="1E293B"/>
+          <w:sz w:val="19"/>
+        </w:rPr>
+        <w:t>依家事事件法第51條準用民事訴訟法第68條第1項但書規定，訴訟代理人經審判長許可者，得委任非律師為之。受任人廖倫豪為委任人黃月玲之親生長子，屬一親等直系血親，完全符合「民事訴訟事件委任非律師為訴訟代理人許可準則」第2條所定得予許可之法定要件；且受任人至為熟悉委任人之健康與家庭財產狀況，足以協助釐清事實真相，爰懇請 鈞院依法准予許可受任人為本件代理人，實感德便。</w:t>
+      </w:r>
+    </w:p>
+    <w:p>
+      <w:pPr>
+        <w:spacing w:before="160"/>
+      </w:pPr>
+      <w:r>
+        <w:rPr>
+          <w:sz w:val="19"/>
+        </w:rPr>
+        <w:t xml:space="preserve">　　謹　狀</w:t>
+        <w:br/>
+        <w:t>臺灣臺中地方法院家事法庭　公鑒</w:t>
+        <w:br/>
+        <w:br/>
+        <w:t>檢附證物：戶籍謄本（證明母子關係）一件、受任人廖倫豪國民身分證正反面影本一件。</w:t>
+        <w:br/>
+      </w:r>
+    </w:p>
+    <w:tbl>
+      <w:tblPr>
+        <w:tblW w:type="auto" w:w="0"/>
+        <w:jc w:val="center"/>
+        <w:tblLook w:firstColumn="1" w:firstRow="1" w:lastColumn="0" w:lastRow="0" w:noHBand="0" w:noVBand="1" w:val="04A0"/>
+      </w:tblPr>
+      <w:tblGrid>
+        <w:gridCol w:w="4706"/>
+        <w:gridCol w:w="4706"/>
+      </w:tblGrid>
+      <w:tr>
+        <w:tc>
+          <w:tcPr>
+            <w:tcW w:type="dxa" w:w="4706"/>
+            <w:tcMar>
+              <w:top w:w="60" w:type="dxa"/>
+              <w:bottom w:w="60" w:type="dxa"/>
+              <w:left w:w="100" w:type="dxa"/>
+              <w:right w:w="100" w:type="dxa"/>
+            </w:tcMar>
+            <w:shd w:fill="F8FAFC"/>
+          </w:tcPr>
+          <w:p>
+            <w:r>
+              <w:rPr>
+                <w:sz w:val="19"/>
+              </w:rPr>
+              <w:t>委任人（具狀人）：黃月玲</w:t>
+              <w:br/>
+              <w:t>身分證字號：M200125756</w:t>
+            </w:r>
+          </w:p>
+        </w:tc>
+        <w:tc>
+          <w:tcPr>
+            <w:tcW w:type="dxa" w:w="4706"/>
+            <w:tcMar>
+              <w:top w:w="60" w:type="dxa"/>
+              <w:bottom w:w="60" w:type="dxa"/>
+              <w:left w:w="100" w:type="dxa"/>
+              <w:right w:w="100" w:type="dxa"/>
+            </w:tcMar>
+            <w:shd w:fill="F1F5F9"/>
+          </w:tcPr>
+          <w:p>
+            <w:r>
+              <w:rPr>
+                <w:sz w:val="19"/>
+              </w:rPr>
+              <w:t>（親自簽名或蓋章／按捺右手姆指印處）</w:t>
+              <w:br/>
+              <w:br/>
+              <w:br/>
+            </w:r>
+          </w:p>
+        </w:tc>
+      </w:tr>
+      <w:tr>
+        <w:tc>
+          <w:tcPr>
+            <w:tcW w:type="dxa" w:w="4706"/>
+            <w:tcMar>
+              <w:top w:w="60" w:type="dxa"/>
+              <w:bottom w:w="60" w:type="dxa"/>
+              <w:left w:w="100" w:type="dxa"/>
+              <w:right w:w="100" w:type="dxa"/>
+            </w:tcMar>
+            <w:shd w:fill="F8FAFC"/>
+          </w:tcPr>
+          <w:p>
+            <w:r>
+              <w:rPr>
+                <w:sz w:val="19"/>
+              </w:rPr>
+              <w:t>受任人（訴訟代理人）：廖倫豪</w:t>
+              <w:br/>
+              <w:t>身分證字號：M120547578</w:t>
+            </w:r>
+          </w:p>
+        </w:tc>
+        <w:tc>
+          <w:tcPr>
+            <w:tcW w:type="dxa" w:w="4706"/>
+            <w:tcMar>
+              <w:top w:w="60" w:type="dxa"/>
+              <w:bottom w:w="60" w:type="dxa"/>
               <w:left w:w="100" w:type="dxa"/>
               <w:right w:w="100" w:type="dxa"/>
             </w:tcMar>
@@ -182,87 +393,18 @@
           </w:p>
         </w:tc>
       </w:tr>
-      <w:tr>
-        <w:tc>
-          <w:tcPr>
-            <w:tcW w:type="dxa" w:w="4706"/>
-            <w:tcMar>
-              <w:top w:w="80" w:type="dxa"/>
-              <w:bottom w:w="80" w:type="dxa"/>
-              <w:left w:w="100" w:type="dxa"/>
-              <w:right w:w="100" w:type="dxa"/>
-            </w:tcMar>
-          </w:tcPr>
-          <w:p>
-            <w:r>
-              <w:rPr>
-                <w:b w:val="0"/>
-                <w:sz w:val="19"/>
-              </w:rPr>
-              <w:t>中　華　民　國　　　　年　　　　月　　　　日</w:t>
-            </w:r>
-          </w:p>
-        </w:tc>
-        <w:tc>
-          <w:tcPr>
-            <w:tcW w:type="dxa" w:w="4706"/>
-            <w:tcMar>
-              <w:top w:w="80" w:type="dxa"/>
-              <w:bottom w:w="80" w:type="dxa"/>
-              <w:left w:w="100" w:type="dxa"/>
-              <w:right w:w="100" w:type="dxa"/>
-            </w:tcMar>
-          </w:tcPr>
-          <w:p>
-            <w:r>
-              <w:rPr>
-                <w:sz w:val="19"/>
-              </w:rPr>
-            </w:r>
-          </w:p>
-        </w:tc>
-      </w:tr>
-      <w:tr>
-        <w:tc>
-          <w:tcPr>
-            <w:tcW w:type="dxa" w:w="4706"/>
-            <w:tcMar>
-              <w:top w:w="80" w:type="dxa"/>
-              <w:bottom w:w="80" w:type="dxa"/>
-              <w:left w:w="100" w:type="dxa"/>
-              <w:right w:w="100" w:type="dxa"/>
-            </w:tcMar>
-          </w:tcPr>
-          <w:p>
-            <w:r>
-              <w:rPr>
-                <w:b w:val="0"/>
-                <w:sz w:val="19"/>
-              </w:rPr>
-              <w:t>管轄法院：臺灣臺中地方法院 家事法庭 / 民事庭　公鑒</w:t>
-            </w:r>
-          </w:p>
-        </w:tc>
-        <w:tc>
-          <w:tcPr>
-            <w:tcW w:type="dxa" w:w="4706"/>
-            <w:tcMar>
-              <w:top w:w="80" w:type="dxa"/>
-              <w:bottom w:w="80" w:type="dxa"/>
-              <w:left w:w="100" w:type="dxa"/>
-              <w:right w:w="100" w:type="dxa"/>
-            </w:tcMar>
-          </w:tcPr>
-          <w:p>
-            <w:r>
-              <w:rPr>
-                <w:sz w:val="19"/>
-              </w:rPr>
-            </w:r>
-          </w:p>
-        </w:tc>
-      </w:tr>
     </w:tbl>
+    <w:p>
+      <w:pPr>
+        <w:spacing w:before="120"/>
+      </w:pPr>
+      <w:r>
+        <w:rPr>
+          <w:sz w:val="19"/>
+        </w:rPr>
+        <w:t>中　華　民　國　　１１５　　年　　１０　　月　　　　日</w:t>
+      </w:r>
+    </w:p>
     <w:p>
       <w:r>
         <w:br w:type="page"/>
@@ -270,7 +412,7 @@
     </w:p>
     <w:p>
       <w:pPr>
-        <w:spacing w:before="160" w:after="40"/>
+        <w:spacing w:before="120" w:after="40"/>
         <w:jc w:val="center"/>
       </w:pPr>
       <w:r>
@@ -278,34 +420,34 @@
           <w:rFonts w:ascii="PingFang TC" w:hAnsi="PingFang TC"/>
           <w:b/>
           <w:color w:val="1E3A8A"/>
-          <w:sz w:val="36"/>
+          <w:sz w:val="34"/>
         </w:rPr>
-        <w:t>財政部國稅局查調個人財產與所得資料委託書</w:t>
+        <w:t>財政部國稅局查調個人財產及所得資料委託書</w:t>
       </w:r>
     </w:p>
     <w:p>
       <w:pPr>
-        <w:spacing w:after="240"/>
+        <w:spacing w:after="200"/>
         <w:jc w:val="center"/>
       </w:pPr>
       <w:r>
         <w:rPr>
           <w:rFonts w:ascii="PingFang TC" w:hAnsi="PingFang TC"/>
           <w:color w:val="64748B"/>
-          <w:sz w:val="20"/>
+          <w:sz w:val="19"/>
         </w:rPr>
-        <w:t>查調父親廖光輝名下總歸戶、大額存款利息、近三年所得專用</w:t>
+        <w:t>全面清查廖光輝名下總歸戶、大額存款利息、近三年所得專用</w:t>
       </w:r>
     </w:p>
     <w:p>
       <w:pPr>
-        <w:spacing w:line="312" w:lineRule="auto" w:after="160"/>
+        <w:spacing w:before="120" w:after="120"/>
       </w:pPr>
       <w:r>
         <w:rPr>
-          <w:sz w:val="21"/>
+          <w:sz w:val="20"/>
         </w:rPr>
-        <w:t>委託人因事務繁忙或身體不適無法親自前往，茲全權委託受託人向貴局申辦下列勾選之稅務資料查調事宜：</w:t>
+        <w:t>委託人黃月玲因健康欠安與事務繁忙不便親自前往，茲依法全權委託受託人廖倫豪向 貴局申辦下列勾選之稅務與財產資料查調事宜：</w:t>
         <w:br/>
       </w:r>
     </w:p>
@@ -319,7 +461,7 @@
           <w:color w:val="1E293B"/>
           <w:sz w:val="19"/>
         </w:rPr>
-        <w:t>☑ 查調全戶／個人「全國財產稅總歸戶財產查詢清單」（清查全部不動產持分、地號建號、持分現值）</w:t>
+        <w:t>☑ 查調委託人及配偶廖光輝之「全國財產稅總歸戶財產查詢清單」（清查全部不動產持分、地號建號、公告現值）。</w:t>
       </w:r>
     </w:p>
     <w:p>
@@ -332,7 +474,7 @@
           <w:color w:val="1E293B"/>
           <w:sz w:val="19"/>
         </w:rPr>
-        <w:t>☑ 查調「近三年綜合所得稅各類所得資料清單」（反推銀行百萬定存帳戶、上市公司股票股利）</w:t>
+        <w:t>☑ 查調配偶廖光輝之「近三年綜合所得稅各類所得資料清單」（反推各銀行大額定存帳戶、上市櫃股票股利明細）。</w:t>
       </w:r>
     </w:p>
     <w:p>
@@ -345,7 +487,7 @@
           <w:color w:val="1E293B"/>
           <w:sz w:val="19"/>
         </w:rPr>
-        <w:t>☑ 查調「被繼承人／贈與人近五年贈與稅申報清單與繳清證明」</w:t>
+        <w:t>☑ 查調配偶廖光輝「近五年贈與稅申報清單與繳清證明」（追查是否有大額資金或房地產無償移轉登記予第三者湛明輝）。</w:t>
       </w:r>
     </w:p>
     <w:p>
@@ -358,7 +500,7 @@
           <w:color w:val="1E293B"/>
           <w:sz w:val="19"/>
         </w:rPr>
-        <w:t>☑ 申請核發綜合所得稅各類所得及財產清單之中文正式證明書</w:t>
+        <w:t>☑ 申請核發綜合所得稅各類所得及財產清單之中文正式證明書供法院訴訟使用。</w:t>
       </w:r>
     </w:p>
     <w:tbl>
@@ -388,15 +530,15 @@
               <w:rPr>
                 <w:sz w:val="19"/>
               </w:rPr>
-              <w:t>委託人（申請人）：</w:t>
+              <w:t>委託人（申請人）：黃月玲</w:t>
               <w:br/>
-              <w:t>身分證字號：</w:t>
+              <w:t>國民身分證統一編號：M200125756</w:t>
               <w:br/>
-              <w:t>出生年月日：</w:t>
+              <w:t>出生年月日：民國38年02月03日</w:t>
               <w:br/>
-              <w:t>戶籍地址：</w:t>
+              <w:t>戶籍地址：臺中市西屯區青海路一段75巷7號</w:t>
               <w:br/>
-              <w:t>聯絡電話：</w:t>
+              <w:t>聯絡電話：04-23131433</w:t>
             </w:r>
           </w:p>
         </w:tc>
@@ -416,7 +558,7 @@
               <w:rPr>
                 <w:sz w:val="19"/>
               </w:rPr>
-              <w:t>（委託人蓋章／印鑑章）</w:t>
+              <w:t>（委託人蓋印鑑章／按指印處）</w:t>
               <w:br/>
               <w:br/>
               <w:br/>
@@ -442,15 +584,15 @@
               <w:rPr>
                 <w:sz w:val="19"/>
               </w:rPr>
-              <w:t>受託人（代辦代理人）：</w:t>
+              <w:t>受託人（受任代辦人）：廖倫豪</w:t>
               <w:br/>
-              <w:t>身分證字號：</w:t>
+              <w:t>國民身分證統一編號：M120547578</w:t>
               <w:br/>
-              <w:t>出生年月日：</w:t>
+              <w:t>出生年月日：民國68年05月</w:t>
               <w:br/>
-              <w:t>戶籍地址：</w:t>
+              <w:t>戶籍地址：臺中市西屯區青海路一段75巷7號一樓</w:t>
               <w:br/>
-              <w:t>聯絡電話：</w:t>
+              <w:t>聯絡電話：0975-323161</w:t>
             </w:r>
           </w:p>
         </w:tc>
@@ -470,7 +612,7 @@
               <w:rPr>
                 <w:sz w:val="19"/>
               </w:rPr>
-              <w:t>（受託人簽名蓋章）</w:t>
+              <w:t>（受託人簽名蓋章處）</w:t>
               <w:br/>
               <w:br/>
               <w:br/>
@@ -482,13 +624,13 @@
     </w:tbl>
     <w:p>
       <w:pPr>
-        <w:spacing w:before="200"/>
+        <w:spacing w:before="160"/>
       </w:pPr>
       <w:r>
         <w:rPr>
           <w:sz w:val="19"/>
         </w:rPr>
-        <w:t>中　華　民　國　　　　年　　　　月　　　　日</w:t>
+        <w:t>中　華　民　國　　１１５　　年　　　　月　　　　日</w:t>
         <w:br/>
         <w:t>此致　財政部中區國稅局　民權稽徵所 / 大屯稽徵所 / 各分局稽徵所　公鑒</w:t>
       </w:r>
@@ -500,7 +642,7 @@
     </w:p>
     <w:p>
       <w:pPr>
-        <w:spacing w:before="160" w:after="40"/>
+        <w:spacing w:before="120" w:after="40"/>
         <w:jc w:val="center"/>
       </w:pPr>
       <w:r>
@@ -508,34 +650,34 @@
           <w:rFonts w:ascii="PingFang TC" w:hAnsi="PingFang TC"/>
           <w:b/>
           <w:color w:val="1E3A8A"/>
-          <w:sz w:val="36"/>
+          <w:sz w:val="34"/>
         </w:rPr>
         <w:t>行政代辦／身心障礙鑑定／地政謄本請領委託書</w:t>
       </w:r>
     </w:p>
     <w:p>
       <w:pPr>
-        <w:spacing w:after="240"/>
+        <w:spacing w:after="200"/>
         <w:jc w:val="center"/>
       </w:pPr>
       <w:r>
         <w:rPr>
           <w:rFonts w:ascii="PingFang TC" w:hAnsi="PingFang TC"/>
           <w:color w:val="64748B"/>
-          <w:sz w:val="20"/>
+          <w:sz w:val="19"/>
         </w:rPr>
-        <w:t>區公所領取身心障礙表單、地政事務所申請「地籍異動索引」專用</w:t>
+        <w:t>區公所申領身心障礙表單、地政事務所調閱「地籍異動索引」專用</w:t>
       </w:r>
     </w:p>
     <w:p>
       <w:pPr>
-        <w:spacing w:line="312" w:lineRule="auto" w:after="160"/>
+        <w:spacing w:before="120" w:after="120"/>
       </w:pPr>
       <w:r>
         <w:rPr>
-          <w:sz w:val="21"/>
+          <w:sz w:val="20"/>
         </w:rPr>
-        <w:t>委託人茲委託受託人全權代表本人向主管機關辦理下列事項：</w:t>
+        <w:t>委託人黃月玲茲依法全權委託受託人廖倫豪向各該主管機關辦理下列事項：</w:t>
         <w:br/>
       </w:r>
     </w:p>
@@ -545,9 +687,11 @@
       </w:pPr>
       <w:r>
         <w:rPr>
+          <w:b/>
+          <w:color w:val="1E293B"/>
           <w:sz w:val="19"/>
         </w:rPr>
-        <w:t>☑ 代理向戶籍地區公所社會課申領「身心障礙者鑑定表」及相關補助申請。</w:t>
+        <w:t>☑ 代理向戶籍地區公所社會課申領「身心障礙者鑑定表」及辦理各項長照、身障福利評估申請。</w:t>
       </w:r>
     </w:p>
     <w:p>
@@ -556,9 +700,11 @@
       </w:pPr>
       <w:r>
         <w:rPr>
+          <w:b/>
+          <w:color w:val="1E293B"/>
           <w:sz w:val="19"/>
         </w:rPr>
-        <w:t>☑ 代理向戶政事務所申領委託人及利害關係人之「全戶現戶戶籍謄本」及「除戶謄本」。</w:t>
+        <w:t>☑ 代理向戶政事務所申領委託人全戶之「全戶現戶戶籍謄本」及配偶廖光輝之詳細記事戶籍謄本。</w:t>
       </w:r>
     </w:p>
     <w:p>
@@ -567,9 +713,11 @@
       </w:pPr>
       <w:r>
         <w:rPr>
+          <w:b/>
+          <w:color w:val="1E293B"/>
           <w:sz w:val="19"/>
         </w:rPr>
-        <w:t>☑ 代理向地政事務所申請特定地號建號之「地籍謄本」、「建物測量成果圖」及「地籍異動索引」（查明產權移轉予第三者湛明輝之登記日期、過戶原因及公文書傳票）。</w:t>
+        <w:t>☑ 代理向地政事務所申請特定建物與土地之「地籍異動索引」、「土地及建物登記公務謄本」（查明廖光輝產權在何時、以何原因移轉過戶登記予第三者湛明輝之完整傳票紀錄）。</w:t>
       </w:r>
     </w:p>
     <w:tbl>
@@ -599,15 +747,15 @@
               <w:rPr>
                 <w:sz w:val="19"/>
               </w:rPr>
-              <w:t>委託人（申請人）：</w:t>
+              <w:t>委託人（申請人）：黃月玲</w:t>
               <w:br/>
-              <w:t>身分證字號：</w:t>
+              <w:t>國民身分證統一編號：M200125756</w:t>
               <w:br/>
-              <w:t>出生年月日：</w:t>
+              <w:t>出生年月日：民國38年02月03日</w:t>
               <w:br/>
-              <w:t>戶籍地址：</w:t>
+              <w:t>戶籍地址：臺中市西屯區青海路一段75巷7號</w:t>
               <w:br/>
-              <w:t>聯絡電話：</w:t>
+              <w:t>聯絡電話：04-23131433</w:t>
             </w:r>
           </w:p>
         </w:tc>
@@ -627,7 +775,7 @@
               <w:rPr>
                 <w:sz w:val="19"/>
               </w:rPr>
-              <w:t>（委託人蓋章／印鑑章）</w:t>
+              <w:t>（委託人蓋印鑑章／按指印處）</w:t>
               <w:br/>
               <w:br/>
               <w:br/>
@@ -653,15 +801,15 @@
               <w:rPr>
                 <w:sz w:val="19"/>
               </w:rPr>
-              <w:t>受託人（代辦代理人）：</w:t>
+              <w:t>受託人（受任代辦人）：廖倫豪</w:t>
               <w:br/>
-              <w:t>身分證字號：</w:t>
+              <w:t>國民身分證統一編號：M120547578</w:t>
               <w:br/>
-              <w:t>出生年月日：</w:t>
+              <w:t>出生年月日：民國68年05月</w:t>
               <w:br/>
-              <w:t>戶籍地址：</w:t>
+              <w:t>戶籍地址：臺中市西屯區青海路一段75巷7號一樓</w:t>
               <w:br/>
-              <w:t>聯絡電話：</w:t>
+              <w:t>聯絡電話：0975-323161</w:t>
             </w:r>
           </w:p>
         </w:tc>
@@ -681,7 +829,7 @@
               <w:rPr>
                 <w:sz w:val="19"/>
               </w:rPr>
-              <w:t>（受託人簽名蓋章）</w:t>
+              <w:t>（受託人簽名蓋章處）</w:t>
               <w:br/>
               <w:br/>
               <w:br/>
@@ -693,16 +841,49 @@
     </w:tbl>
     <w:p>
       <w:pPr>
-        <w:spacing w:before="240" w:after="80"/>
+        <w:spacing w:before="160"/>
+      </w:pPr>
+      <w:r>
+        <w:rPr>
+          <w:sz w:val="19"/>
+        </w:rPr>
+        <w:t>中　華　民　國　　１１５　　年　　　　月　　　　日</w:t>
+        <w:br/>
+        <w:t>此致　臺中市各區公所 / 各區戶政事務所 / 各區地政事務所　公鑒</w:t>
+      </w:r>
+    </w:p>
+    <w:p>
+      <w:r>
+        <w:br w:type="page"/>
+      </w:r>
+    </w:p>
+    <w:p>
+      <w:pPr>
+        <w:spacing w:before="120" w:after="40"/>
+        <w:jc w:val="center"/>
       </w:pPr>
       <w:r>
         <w:rPr>
           <w:rFonts w:ascii="PingFang TC" w:hAnsi="PingFang TC"/>
           <w:b/>
           <w:color w:val="1E3A8A"/>
-          <w:sz w:val="26"/>
+          <w:sz w:val="34"/>
         </w:rPr>
-        <w:t>💡 律師實務用印與簽署特別說明（非常重要）</w:t>
+        <w:t>家事法庭調解期日教戰守則（115年10月19日）</w:t>
+      </w:r>
+    </w:p>
+    <w:p>
+      <w:pPr>
+        <w:spacing w:after="200"/>
+        <w:jc w:val="center"/>
+      </w:pPr>
+      <w:r>
+        <w:rPr>
+          <w:rFonts w:ascii="PingFang TC" w:hAnsi="PingFang TC"/>
+          <w:color w:val="64748B"/>
+          <w:sz w:val="19"/>
+        </w:rPr>
+        <w:t>案件：115年度家補字第3880號（意股） ‧ 書記官黃俞婷（分機3989）</w:t>
       </w:r>
     </w:p>
     <w:p>
@@ -713,16 +894,17 @@
         <w:rPr>
           <w:b/>
           <w:color w:val="1E3A8A"/>
-          <w:sz w:val="19"/>
+          <w:sz w:val="20"/>
         </w:rPr>
-        <w:t>• 【母親失智無法簽名時】：</w:t>
+        <w:t>★ 【開庭時間與地點】：</w:t>
+        <w:br/>
       </w:r>
       <w:r>
         <w:rPr>
           <w:color w:val="1E293B"/>
           <w:sz w:val="19"/>
         </w:rPr>
-        <w:t>依民法第3條規定，當事人若不便親自簽名，可由他人代筆書寫姓名，再由母親本人「按捺右手大拇指指印」並加蓋母親平時使用之「印鑑章／私章」，法律效力等同親自簽名。</w:t>
+        <w:t>115年10月19日（星期一）下午3時00分，請於下午2時45分前至臺灣臺中地方法院簡易大樓6樓調解室報到。</w:t>
       </w:r>
     </w:p>
     <w:p>
@@ -733,16 +915,17 @@
         <w:rPr>
           <w:b/>
           <w:color w:val="1E3A8A"/>
-          <w:sz w:val="19"/>
+          <w:sz w:val="20"/>
         </w:rPr>
-        <w:t>• 【臨櫃代辦必備雙方證件】：</w:t>
+        <w:t>★ 【當天必備文件清單】：</w:t>
+        <w:br/>
       </w:r>
       <w:r>
         <w:rPr>
           <w:color w:val="1E293B"/>
           <w:sz w:val="19"/>
         </w:rPr>
-        <w:t>辦理國稅局、戶政、地政臨櫃業務時，受託人必須攜帶：① 委託人身分證正本、② 受託人身分證正本、③ 雙方印章、④ 本委任書。</w:t>
+        <w:t>① 本家事委任狀正本、② 廖倫豪國民身分證正本、③ 能證明母子關係之戶籍謄本正本、④ 廖光輝起訴狀繕本及法院開庭通知書。</w:t>
       </w:r>
     </w:p>
     <w:p>
@@ -753,16 +936,63 @@
         <w:rPr>
           <w:b/>
           <w:color w:val="1E3A8A"/>
-          <w:sz w:val="19"/>
+          <w:sz w:val="20"/>
         </w:rPr>
-        <w:t>• 【委任律師出庭時】：</w:t>
+        <w:t>★ 【母親失智無法簽名時】：</w:t>
+        <w:br/>
       </w:r>
       <w:r>
         <w:rPr>
           <w:color w:val="1E293B"/>
           <w:sz w:val="19"/>
         </w:rPr>
-        <w:t>若後續正式委任執業律師出庭，律師事務所會直接出具載有律師姓名與案號的專用委任狀給您簽章，無須使用坊間便條。</w:t>
+        <w:t>依民法第3條規定，當事人若因病不便簽名，可由受任人在委任人欄代簽黃月玲姓名，再由母親本人「按捺右手大拇指指印」並加蓋母親平時使用之「印鑑章／私章」，法律效力等同親簽。</w:t>
+      </w:r>
+    </w:p>
+    <w:p>
+      <w:pPr>
+        <w:spacing w:before="80" w:after="80"/>
+      </w:pPr>
+      <w:r>
+        <w:rPr>
+          <w:b/>
+          <w:color w:val="B91C1C"/>
+          <w:sz w:val="20"/>
+        </w:rPr>
+        <w:t>★ 【當天調解應對「三不原則」】：</w:t>
+        <w:br/>
+      </w:r>
+      <w:r>
+        <w:rPr>
+          <w:color w:val="1E293B"/>
+          <w:sz w:val="19"/>
+        </w:rPr>
+        <w:t>①【堅決不同意離婚】：表明雙方結縭近五十年，母親現罹患失智重症，父親負有法定照顧責任，依法依理均無理由離婚。</w:t>
+        <w:br/>
+        <w:t>②【不談具體數字】：對方若提補償金，請對方先提出具體金額與資產清冊，我方保留答辯權，其他意見以書狀補充。</w:t>
+        <w:br/>
+        <w:t>③【絕不簽字】：調解委員若勸和或提出任何協議草案，一律表明「需帶回與家屬討論，今天不簽任何調解筆錄」。</w:t>
+      </w:r>
+    </w:p>
+    <w:p>
+      <w:pPr>
+        <w:spacing w:before="80" w:after="80"/>
+      </w:pPr>
+      <w:r>
+        <w:rPr>
+          <w:b/>
+          <w:color w:val="1E3A8A"/>
+          <w:sz w:val="20"/>
+        </w:rPr>
+        <w:t>★ 【事前聯繫確認】：</w:t>
+        <w:br/>
+      </w:r>
+      <w:r>
+        <w:rPr>
+          <w:color w:val="1E293B"/>
+          <w:sz w:val="19"/>
+        </w:rPr>
+        <w:t>建議開庭前致電臺中地院承辦書記官（黃俞婷，電話：04-22232311 分機3989），告知「相對人黃月玲年邁重病，當日由長子廖倫豪持委任狀代理出席」。</w:t>
       </w:r>
     </w:p>
     <w:sectPr>

</xml_diff>

<commit_message>
fix: update Liao Howard birth date to 62.07.19
</commit_message>
<xml_diff>
--- a/3.住/家事訴訟與行政代辦_法定委任書套件.docx
+++ b/3.住/家事訴訟與行政代辦_法定委任書套件.docx
@@ -581,14 +581,11 @@
           </w:tcPr>
           <w:p>
             <w:r>
-              <w:rPr>
-                <w:sz w:val="19"/>
-              </w:rPr>
               <w:t>受託人（受任代辦人）：廖倫豪</w:t>
               <w:br/>
               <w:t>國民身分證統一編號：M120547578</w:t>
               <w:br/>
-              <w:t>出生年月日：民國68年05月</w:t>
+              <w:t>出生年月日：民國62年07月19日</w:t>
               <w:br/>
               <w:t>戶籍地址：臺中市西屯區青海路一段75巷7號一樓</w:t>
               <w:br/>
@@ -798,14 +795,11 @@
           </w:tcPr>
           <w:p>
             <w:r>
-              <w:rPr>
-                <w:sz w:val="19"/>
-              </w:rPr>
               <w:t>受託人（受任代辦人）：廖倫豪</w:t>
               <w:br/>
               <w:t>國民身分證統一編號：M120547578</w:t>
               <w:br/>
-              <w:t>出生年月日：民國68年05月</w:t>
+              <w:t>出生年月日：民國62年07月19日</w:t>
               <w:br/>
               <w:t>戶籍地址：臺中市西屯區青海路一段75巷7號一樓</w:t>
               <w:br/>

</xml_diff>

<commit_message>
fix: align Liao Howard registered address exactly identical to Huang Yueh-ling
</commit_message>
<xml_diff>
--- a/3.住/家事訴訟與行政代辦_法定委任書套件.docx
+++ b/3.住/家事訴訟與行政代辦_法定委任書套件.docx
@@ -128,9 +128,11 @@
               <w:br/>
               <w:t>國民身分證統一編號：M200125756</w:t>
               <w:br/>
-              <w:t>住居所：臺中市西屯區何安里14鄰青海路一段75巷7號</w:t>
+              <w:t>出生年月日：民國38年02月03日</w:t>
               <w:br/>
-              <w:t>電話：04-23131433</w:t>
+              <w:t>戶籍住址：臺中市西屯區何安里14鄰青海路一段75巷7號</w:t>
+              <w:br/>
+              <w:t>聯絡電話：04-23131433</w:t>
             </w:r>
           </w:p>
         </w:tc>
@@ -160,41 +162,15 @@
               <w:br/>
               <w:t>國民身分證統一編號：M120547578</w:t>
               <w:br/>
-              <w:t>住居所：臺中市西屯區青海路一段75巷7號一樓</w:t>
+              <w:t>出生年月日：民國62年07月19日</w:t>
               <w:br/>
-              <w:t>電話：0975-323161</w:t>
+              <w:t>戶籍住址：臺中市西屯區何安里14鄰青海路一段75巷7號</w:t>
+              <w:br/>
+              <w:t>聯絡電話：0975-323161</w:t>
               <w:br/>
               <w:t>與委任人關係：母子（一親等直系血親卑親屬）</w:t>
             </w:r>
           </w:p>
-        </w:tc>
-      </w:tr>
-      <w:tr>
-        <w:tc>
-          <w:tcPr>
-            <w:tcW w:type="dxa" w:w="4706"/>
-          </w:tcPr>
-          <w:p/>
-        </w:tc>
-        <w:tc>
-          <w:tcPr>
-            <w:tcW w:type="dxa" w:w="4706"/>
-          </w:tcPr>
-          <w:p/>
-        </w:tc>
-      </w:tr>
-      <w:tr>
-        <w:tc>
-          <w:tcPr>
-            <w:tcW w:type="dxa" w:w="4706"/>
-          </w:tcPr>
-          <w:p/>
-        </w:tc>
-        <w:tc>
-          <w:tcPr>
-            <w:tcW w:type="dxa" w:w="4706"/>
-          </w:tcPr>
-          <w:p/>
         </w:tc>
       </w:tr>
     </w:tbl>
@@ -285,7 +261,7 @@
         <w:t>臺灣臺中地方法院家事法庭　公鑒</w:t>
         <w:br/>
         <w:br/>
-        <w:t>檢附證物：戶籍謄本（證明母子關係）一件、受任人廖倫豪國民身分證正反面影本一件。</w:t>
+        <w:t>檢附證物：戶籍謄本（證明母子關係與同戶籍）一件、受任人廖倫豪國民身分證正反面影本一件。</w:t>
         <w:br/>
       </w:r>
     </w:p>
@@ -536,7 +512,7 @@
               <w:br/>
               <w:t>出生年月日：民國38年02月03日</w:t>
               <w:br/>
-              <w:t>戶籍地址：臺中市西屯區青海路一段75巷7號</w:t>
+              <w:t>戶籍地址：臺中市西屯區何安里14鄰青海路一段75巷7號</w:t>
               <w:br/>
               <w:t>聯絡電話：04-23131433</w:t>
             </w:r>
@@ -581,13 +557,16 @@
           </w:tcPr>
           <w:p>
             <w:r>
+              <w:rPr>
+                <w:sz w:val="19"/>
+              </w:rPr>
               <w:t>受託人（受任代辦人）：廖倫豪</w:t>
               <w:br/>
               <w:t>國民身分證統一編號：M120547578</w:t>
               <w:br/>
               <w:t>出生年月日：民國62年07月19日</w:t>
               <w:br/>
-              <w:t>戶籍地址：臺中市西屯區青海路一段75巷7號一樓</w:t>
+              <w:t>戶籍地址：臺中市西屯區何安里14鄰青海路一段75巷7號</w:t>
               <w:br/>
               <w:t>聯絡電話：0975-323161</w:t>
             </w:r>
@@ -750,7 +729,7 @@
               <w:br/>
               <w:t>出生年月日：民國38年02月03日</w:t>
               <w:br/>
-              <w:t>戶籍地址：臺中市西屯區青海路一段75巷7號</w:t>
+              <w:t>戶籍地址：臺中市西屯區何安里14鄰青海路一段75巷7號</w:t>
               <w:br/>
               <w:t>聯絡電話：04-23131433</w:t>
             </w:r>
@@ -795,13 +774,16 @@
           </w:tcPr>
           <w:p>
             <w:r>
+              <w:rPr>
+                <w:sz w:val="19"/>
+              </w:rPr>
               <w:t>受託人（受任代辦人）：廖倫豪</w:t>
               <w:br/>
               <w:t>國民身分證統一編號：M120547578</w:t>
               <w:br/>
               <w:t>出生年月日：民國62年07月19日</w:t>
               <w:br/>
-              <w:t>戶籍地址：臺中市西屯區青海路一段75巷7號一樓</w:t>
+              <w:t>戶籍地址：臺中市西屯區何安里14鄰青海路一段75巷7號</w:t>
               <w:br/>
               <w:t>聯絡電話：0975-323161</w:t>
             </w:r>
@@ -919,7 +901,7 @@
           <w:color w:val="1E293B"/>
           <w:sz w:val="19"/>
         </w:rPr>
-        <w:t>① 本家事委任狀正本、② 廖倫豪國民身分證正本、③ 能證明母子關係之戶籍謄本正本、④ 廖光輝起訴狀繕本及法院開庭通知書。</w:t>
+        <w:t>① 本家事委任狀正本、② 廖倫豪國民身分證正本、③ 能證明母子關係且同戶籍之戶籍謄本正本、④ 廖光輝起訴狀繕本及法院開庭通知書。</w:t>
       </w:r>
     </w:p>
     <w:p>
@@ -986,7 +968,7 @@
           <w:color w:val="1E293B"/>
           <w:sz w:val="19"/>
         </w:rPr>
-        <w:t>建議開庭前致電臺中地院承辦書記官（黃俞婷，電話：04-22232311 分機3989），告知「相對人黃月玲年邁重病，當日由長子廖倫豪持委任狀代理出席」。</w:t>
+        <w:t>建議開庭前致電臺中地院承辦書記官（黃俞婷，電話：04-22232311 分機3989），告知「相對人黃月玲年邁重病，當日由同戶長子廖倫豪持委任狀代理出席」。</w:t>
       </w:r>
     </w:p>
     <w:sectPr>

</xml_diff>